<commit_message>
docs: synopsis title page with BBDIT logo (from university sample format), tightened one-page layout
</commit_message>
<xml_diff>
--- a/docs/Syrax-Synopsis.docx
+++ b/docs/Syrax-Synopsis.docx
@@ -4,7 +4,47 @@
   <w:body>
     <w:p>
       <w:pPr>
-        <w:spacing w:line="240" w:lineRule="auto" w:before="360" w:after="0"/>
+        <w:spacing w:line="240" w:lineRule="auto" w:before="80"/>
+        <w:jc w:val="center"/>
+      </w:pPr>
+      <w:r>
+        <w:drawing>
+          <wp:inline xmlns:a="http://schemas.openxmlformats.org/drawingml/2006/main" xmlns:pic="http://schemas.openxmlformats.org/drawingml/2006/picture">
+            <wp:extent cx="1080000" cy="781097"/>
+            <wp:docPr id="1" name="Picture 1"/>
+            <wp:cNvGraphicFramePr>
+              <a:graphicFrameLocks noChangeAspect="1"/>
+            </wp:cNvGraphicFramePr>
+            <a:graphic>
+              <a:graphicData uri="http://schemas.openxmlformats.org/drawingml/2006/picture">
+                <pic:pic>
+                  <pic:nvPicPr>
+                    <pic:cNvPr id="0" name="bbdit-logo.jpg"/>
+                    <pic:cNvPicPr/>
+                  </pic:nvPicPr>
+                  <pic:blipFill>
+                    <a:blip r:embed="rId9"/>
+                    <a:stretch>
+                      <a:fillRect/>
+                    </a:stretch>
+                  </pic:blipFill>
+                  <pic:spPr>
+                    <a:xfrm>
+                      <a:off x="0" y="0"/>
+                      <a:ext cx="1080000" cy="781097"/>
+                    </a:xfrm>
+                    <a:prstGeom prst="rect"/>
+                  </pic:spPr>
+                </pic:pic>
+              </a:graphicData>
+            </a:graphic>
+          </wp:inline>
+        </w:drawing>
+      </w:r>
+    </w:p>
+    <w:p>
+      <w:pPr>
+        <w:spacing w:line="240" w:lineRule="auto" w:before="160" w:after="0"/>
         <w:jc w:val="center"/>
       </w:pPr>
       <w:r>
@@ -19,7 +59,7 @@
     </w:p>
     <w:p>
       <w:pPr>
-        <w:spacing w:line="240" w:lineRule="auto" w:before="480" w:after="0"/>
+        <w:spacing w:line="240" w:lineRule="auto" w:before="240" w:after="0"/>
         <w:jc w:val="center"/>
       </w:pPr>
       <w:r>
@@ -34,7 +74,7 @@
     </w:p>
     <w:p>
       <w:pPr>
-        <w:spacing w:line="240" w:lineRule="auto" w:before="360" w:after="0"/>
+        <w:spacing w:line="240" w:lineRule="auto" w:before="240" w:after="0"/>
         <w:jc w:val="center"/>
       </w:pPr>
       <w:r>
@@ -49,7 +89,7 @@
     </w:p>
     <w:p>
       <w:pPr>
-        <w:spacing w:line="240" w:lineRule="auto" w:before="200" w:after="0"/>
+        <w:spacing w:line="240" w:lineRule="auto" w:before="120" w:after="0"/>
         <w:jc w:val="center"/>
       </w:pPr>
       <w:r>
@@ -64,7 +104,7 @@
     </w:p>
     <w:p>
       <w:pPr>
-        <w:spacing w:line="240" w:lineRule="auto" w:before="80" w:after="0"/>
+        <w:spacing w:line="240" w:lineRule="auto" w:before="40" w:after="0"/>
         <w:jc w:val="center"/>
       </w:pPr>
       <w:r>
@@ -79,7 +119,7 @@
     </w:p>
     <w:p>
       <w:pPr>
-        <w:spacing w:line="240" w:lineRule="auto" w:before="200" w:after="0"/>
+        <w:spacing w:line="240" w:lineRule="auto" w:before="120" w:after="0"/>
         <w:jc w:val="center"/>
       </w:pPr>
       <w:r>
@@ -94,7 +134,7 @@
     </w:p>
     <w:p>
       <w:pPr>
-        <w:spacing w:line="240" w:lineRule="auto" w:before="80" w:after="0"/>
+        <w:spacing w:line="240" w:lineRule="auto" w:before="40" w:after="0"/>
         <w:jc w:val="center"/>
       </w:pPr>
       <w:r>
@@ -109,7 +149,7 @@
     </w:p>
     <w:p>
       <w:pPr>
-        <w:spacing w:line="240" w:lineRule="auto" w:before="200" w:after="0"/>
+        <w:spacing w:line="240" w:lineRule="auto" w:before="120" w:after="0"/>
         <w:jc w:val="center"/>
       </w:pPr>
       <w:r>
@@ -124,7 +164,7 @@
     </w:p>
     <w:p>
       <w:pPr>
-        <w:spacing w:line="240" w:lineRule="auto" w:before="80" w:after="0"/>
+        <w:spacing w:line="240" w:lineRule="auto" w:before="40" w:after="0"/>
         <w:jc w:val="center"/>
       </w:pPr>
       <w:r>
@@ -139,7 +179,7 @@
     </w:p>
     <w:p>
       <w:pPr>
-        <w:spacing w:line="360" w:lineRule="auto" w:before="680" w:after="0"/>
+        <w:spacing w:line="360" w:lineRule="auto" w:before="320" w:after="0"/>
         <w:jc w:val="center"/>
       </w:pPr>
       <w:r>
@@ -154,7 +194,7 @@
     </w:p>
     <w:p>
       <w:pPr>
-        <w:spacing w:line="240" w:lineRule="auto" w:before="160" w:after="0"/>
+        <w:spacing w:line="240" w:lineRule="auto" w:before="120" w:after="0"/>
         <w:jc w:val="center"/>
       </w:pPr>
       <w:r>
@@ -169,7 +209,7 @@
     </w:p>
     <w:p>
       <w:pPr>
-        <w:spacing w:line="240" w:lineRule="auto" w:before="80" w:after="0"/>
+        <w:spacing w:line="240" w:lineRule="auto" w:before="40" w:after="0"/>
         <w:jc w:val="center"/>
       </w:pPr>
       <w:r>
@@ -199,7 +239,7 @@
     </w:p>
     <w:p>
       <w:pPr>
-        <w:spacing w:line="240" w:lineRule="auto" w:before="800" w:after="0"/>
+        <w:spacing w:line="240" w:lineRule="auto" w:before="360" w:after="0"/>
         <w:jc w:val="center"/>
       </w:pPr>
       <w:r>
@@ -229,7 +269,7 @@
     </w:p>
     <w:p>
       <w:pPr>
-        <w:spacing w:line="240" w:lineRule="auto" w:before="120" w:after="0"/>
+        <w:spacing w:line="240" w:lineRule="auto" w:before="80" w:after="0"/>
         <w:jc w:val="center"/>
       </w:pPr>
       <w:r>
@@ -244,7 +284,7 @@
     </w:p>
     <w:p>
       <w:pPr>
-        <w:spacing w:line="240" w:lineRule="auto" w:before="120" w:after="0"/>
+        <w:spacing w:line="240" w:lineRule="auto" w:before="80" w:after="0"/>
         <w:jc w:val="center"/>
       </w:pPr>
       <w:r>
@@ -259,7 +299,7 @@
     </w:p>
     <w:p>
       <w:pPr>
-        <w:spacing w:line="240" w:lineRule="auto" w:before="880" w:after="0"/>
+        <w:spacing w:line="240" w:lineRule="auto" w:before="520" w:after="0"/>
         <w:jc w:val="center"/>
       </w:pPr>
       <w:r>

</xml_diff>

<commit_message>
docs: move BBDIT logo below the CSE line on the synopsis title page (36mm, centred)
</commit_message>
<xml_diff>
--- a/docs/Syrax-Synopsis.docx
+++ b/docs/Syrax-Synopsis.docx
@@ -2,46 +2,6 @@
 <file path=word/document.xml><?xml version="1.0" encoding="utf-8"?>
 <w:document xmlns:wpc="http://schemas.microsoft.com/office/word/2010/wordprocessingCanvas" xmlns:mo="http://schemas.microsoft.com/office/mac/office/2008/main" xmlns:mc="http://schemas.openxmlformats.org/markup-compatibility/2006" xmlns:mv="urn:schemas-microsoft-com:mac:vml" xmlns:o="urn:schemas-microsoft-com:office:office" xmlns:r="http://schemas.openxmlformats.org/officeDocument/2006/relationships" xmlns:m="http://schemas.openxmlformats.org/officeDocument/2006/math" xmlns:v="urn:schemas-microsoft-com:vml" xmlns:wp14="http://schemas.microsoft.com/office/word/2010/wordprocessingDrawing" xmlns:wp="http://schemas.openxmlformats.org/drawingml/2006/wordprocessingDrawing" xmlns:w10="urn:schemas-microsoft-com:office:word" xmlns:w="http://schemas.openxmlformats.org/wordprocessingml/2006/main" xmlns:w14="http://schemas.microsoft.com/office/word/2010/wordml" xmlns:wpg="http://schemas.microsoft.com/office/word/2010/wordprocessingGroup" xmlns:wpi="http://schemas.microsoft.com/office/word/2010/wordprocessingInk" xmlns:wne="http://schemas.microsoft.com/office/word/2006/wordml" xmlns:wps="http://schemas.microsoft.com/office/word/2010/wordprocessingShape" mc:Ignorable="w14 wp14">
   <w:body>
-    <w:p>
-      <w:pPr>
-        <w:spacing w:line="240" w:lineRule="auto" w:before="80"/>
-        <w:jc w:val="center"/>
-      </w:pPr>
-      <w:r>
-        <w:drawing>
-          <wp:inline xmlns:a="http://schemas.openxmlformats.org/drawingml/2006/main" xmlns:pic="http://schemas.openxmlformats.org/drawingml/2006/picture">
-            <wp:extent cx="1080000" cy="781097"/>
-            <wp:docPr id="1" name="Picture 1"/>
-            <wp:cNvGraphicFramePr>
-              <a:graphicFrameLocks noChangeAspect="1"/>
-            </wp:cNvGraphicFramePr>
-            <a:graphic>
-              <a:graphicData uri="http://schemas.openxmlformats.org/drawingml/2006/picture">
-                <pic:pic>
-                  <pic:nvPicPr>
-                    <pic:cNvPr id="0" name="bbdit-logo.jpg"/>
-                    <pic:cNvPicPr/>
-                  </pic:nvPicPr>
-                  <pic:blipFill>
-                    <a:blip r:embed="rId9"/>
-                    <a:stretch>
-                      <a:fillRect/>
-                    </a:stretch>
-                  </pic:blipFill>
-                  <pic:spPr>
-                    <a:xfrm>
-                      <a:off x="0" y="0"/>
-                      <a:ext cx="1080000" cy="781097"/>
-                    </a:xfrm>
-                    <a:prstGeom prst="rect"/>
-                  </pic:spPr>
-                </pic:pic>
-              </a:graphicData>
-            </a:graphic>
-          </wp:inline>
-        </w:drawing>
-      </w:r>
-    </w:p>
     <w:p>
       <w:pPr>
         <w:spacing w:line="240" w:lineRule="auto" w:before="160" w:after="0"/>
@@ -239,7 +199,47 @@
     </w:p>
     <w:p>
       <w:pPr>
-        <w:spacing w:line="240" w:lineRule="auto" w:before="360" w:after="0"/>
+        <w:spacing w:line="240" w:lineRule="auto" w:before="240" w:after="0"/>
+        <w:jc w:val="center"/>
+      </w:pPr>
+      <w:r>
+        <w:drawing>
+          <wp:inline xmlns:a="http://schemas.openxmlformats.org/drawingml/2006/main" xmlns:pic="http://schemas.openxmlformats.org/drawingml/2006/picture">
+            <wp:extent cx="1296000" cy="937316"/>
+            <wp:docPr id="1" name="Picture 1"/>
+            <wp:cNvGraphicFramePr>
+              <a:graphicFrameLocks noChangeAspect="1"/>
+            </wp:cNvGraphicFramePr>
+            <a:graphic>
+              <a:graphicData uri="http://schemas.openxmlformats.org/drawingml/2006/picture">
+                <pic:pic>
+                  <pic:nvPicPr>
+                    <pic:cNvPr id="0" name="bbdit-logo.jpg"/>
+                    <pic:cNvPicPr/>
+                  </pic:nvPicPr>
+                  <pic:blipFill>
+                    <a:blip r:embed="rId9"/>
+                    <a:stretch>
+                      <a:fillRect/>
+                    </a:stretch>
+                  </pic:blipFill>
+                  <pic:spPr>
+                    <a:xfrm>
+                      <a:off x="0" y="0"/>
+                      <a:ext cx="1296000" cy="937316"/>
+                    </a:xfrm>
+                    <a:prstGeom prst="rect"/>
+                  </pic:spPr>
+                </pic:pic>
+              </a:graphicData>
+            </a:graphic>
+          </wp:inline>
+        </w:drawing>
+      </w:r>
+    </w:p>
+    <w:p>
+      <w:pPr>
+        <w:spacing w:line="240" w:lineRule="auto" w:before="280" w:after="0"/>
         <w:jc w:val="center"/>
       </w:pPr>
       <w:r>

</xml_diff>